<commit_message>
changing aliases in the generated doc to be semicolon-delimited
</commit_message>
<xml_diff>
--- a/platform/src/petition/templates/petition/petition.docx
+++ b/platform/src/petition/templates/petition/petition.docx
@@ -192,7 +192,6 @@
             <w:pPr>
               <w:pStyle w:val="Normal"/>
               <w:widowControl w:val="false"/>
-              <w:pBdr/>
               <w:spacing w:lineRule="auto" w:line="240" w:before="0" w:after="0"/>
               <w:rPr>
                 <w:rFonts w:eastAsia="Calibri" w:cs="Calibri"/>
@@ -209,7 +208,6 @@
             <w:pPr>
               <w:pStyle w:val="Normal"/>
               <w:widowControl w:val="false"/>
-              <w:pBdr/>
               <w:spacing w:lineRule="auto" w:line="240" w:before="0" w:after="0"/>
               <w:rPr>
                 <w:rFonts w:eastAsia="Calibri" w:cs="Calibri"/>
@@ -226,7 +224,6 @@
             <w:pPr>
               <w:pStyle w:val="Normal"/>
               <w:widowControl w:val="false"/>
-              <w:pBdr/>
               <w:spacing w:lineRule="auto" w:line="240" w:before="0" w:after="0"/>
               <w:rPr>
                 <w:rFonts w:eastAsia="Calibri" w:cs="Calibri"/>
@@ -243,7 +240,6 @@
             <w:pPr>
               <w:pStyle w:val="Normal"/>
               <w:widowControl w:val="false"/>
-              <w:pBdr/>
               <w:spacing w:lineRule="auto" w:line="240" w:before="0" w:after="0"/>
               <w:rPr>
                 <w:rFonts w:eastAsia="Calibri" w:cs="Calibri"/>
@@ -260,7 +256,6 @@
             <w:pPr>
               <w:pStyle w:val="Normal"/>
               <w:widowControl w:val="false"/>
-              <w:pBdr/>
               <w:spacing w:lineRule="auto" w:line="240" w:before="0" w:after="0"/>
               <w:rPr>
                 <w:rFonts w:eastAsia="Calibri" w:cs="Calibri"/>
@@ -277,7 +272,6 @@
             <w:pPr>
               <w:pStyle w:val="Normal"/>
               <w:widowControl w:val="false"/>
-              <w:pBdr/>
               <w:spacing w:lineRule="auto" w:line="240" w:before="0" w:after="0"/>
               <w:rPr>
                 <w:rFonts w:eastAsia="Calibri" w:cs="Calibri"/>
@@ -294,7 +288,6 @@
             <w:pPr>
               <w:pStyle w:val="Normal"/>
               <w:widowControl w:val="false"/>
-              <w:pBdr/>
               <w:spacing w:lineRule="auto" w:line="240" w:before="0" w:after="0"/>
               <w:rPr>
                 <w:rFonts w:eastAsia="Calibri" w:cs="Calibri"/>
@@ -311,7 +304,6 @@
             <w:pPr>
               <w:pStyle w:val="Normal"/>
               <w:widowControl w:val="false"/>
-              <w:pBdr/>
               <w:spacing w:lineRule="auto" w:line="240" w:before="0" w:after="0"/>
               <w:rPr>
                 <w:rFonts w:eastAsia="Calibri" w:cs="Calibri"/>
@@ -848,7 +840,6 @@
           <w:ilvl w:val="0"/>
           <w:numId w:val="1"/>
         </w:numPr>
-        <w:pBdr/>
         <w:spacing w:lineRule="auto" w:line="240" w:before="0" w:after="0"/>
         <w:jc w:val="both"/>
         <w:rPr>
@@ -876,7 +867,6 @@
     <w:p>
       <w:pPr>
         <w:pStyle w:val="Normal"/>
-        <w:pBdr/>
         <w:spacing w:lineRule="auto" w:line="240" w:before="0" w:after="0"/>
         <w:ind w:start="360"/>
         <w:jc w:val="both"/>
@@ -901,7 +891,6 @@
           <w:ilvl w:val="0"/>
           <w:numId w:val="1"/>
         </w:numPr>
-        <w:pBdr/>
         <w:spacing w:lineRule="auto" w:line="240" w:before="0" w:after="0"/>
         <w:jc w:val="both"/>
         <w:rPr>
@@ -923,7 +912,23 @@
           <w:sz w:val="24"/>
           <w:szCs w:val="24"/>
         </w:rPr>
-        <w:t xml:space="preserve"> {{ petitioner.aliases|comma_join }}</w:t>
+        <w:t xml:space="preserve"> {{ petitioner.aliases|</w:t>
+      </w:r>
+      <w:r>
+        <w:rPr>
+          <w:rFonts w:eastAsia="Calibri" w:cs="Calibri"/>
+          <w:sz w:val="24"/>
+          <w:szCs w:val="24"/>
+        </w:rPr>
+        <w:t>join(‘; ‘)</w:t>
+      </w:r>
+      <w:r>
+        <w:rPr>
+          <w:rFonts w:eastAsia="Calibri" w:cs="Calibri"/>
+          <w:sz w:val="24"/>
+          <w:szCs w:val="24"/>
+        </w:rPr>
+        <w:t xml:space="preserve"> }}</w:t>
       </w:r>
     </w:p>
     <w:p>
@@ -944,7 +949,6 @@
           <w:ilvl w:val="0"/>
           <w:numId w:val="1"/>
         </w:numPr>
-        <w:pBdr/>
         <w:spacing w:lineRule="auto" w:line="240" w:before="0" w:after="0"/>
         <w:jc w:val="both"/>
         <w:rPr>
@@ -973,7 +977,6 @@
       <w:pPr>
         <w:pStyle w:val="Normal"/>
         <w:widowControl w:val="false"/>
-        <w:pBdr/>
         <w:spacing w:lineRule="auto" w:line="240" w:before="0" w:after="0"/>
         <w:ind w:start="360" w:end="-20"/>
         <w:rPr>
@@ -1000,7 +1003,6 @@
     <w:p>
       <w:pPr>
         <w:pStyle w:val="Normal"/>
-        <w:pBdr/>
         <w:spacing w:lineRule="auto" w:line="240" w:before="0" w:after="0"/>
         <w:ind w:start="360"/>
         <w:rPr>
@@ -1020,7 +1022,6 @@
           <w:ilvl w:val="0"/>
           <w:numId w:val="1"/>
         </w:numPr>
-        <w:pBdr/>
         <w:spacing w:lineRule="auto" w:line="240" w:before="0" w:after="0"/>
         <w:jc w:val="both"/>
         <w:rPr>
@@ -1048,7 +1049,6 @@
     <w:p>
       <w:pPr>
         <w:pStyle w:val="Normal"/>
-        <w:pBdr/>
         <w:spacing w:lineRule="auto" w:line="240" w:before="0" w:after="0"/>
         <w:ind w:start="360"/>
         <w:jc w:val="both"/>
@@ -1075,7 +1075,6 @@
           <w:ilvl w:val="0"/>
           <w:numId w:val="1"/>
         </w:numPr>
-        <w:pBdr/>
         <w:spacing w:lineRule="auto" w:line="240" w:before="0" w:after="0"/>
         <w:jc w:val="both"/>
         <w:rPr>
@@ -1118,7 +1117,6 @@
           <w:ilvl w:val="0"/>
           <w:numId w:val="1"/>
         </w:numPr>
-        <w:pBdr/>
         <w:spacing w:lineRule="auto" w:line="240" w:before="0" w:after="0"/>
         <w:jc w:val="both"/>
         <w:rPr>
@@ -1142,7 +1140,6 @@
       <w:pPr>
         <w:pStyle w:val="Normal"/>
         <w:widowControl w:val="false"/>
-        <w:pBdr/>
         <w:spacing w:lineRule="auto" w:line="240" w:before="0" w:after="0"/>
         <w:ind w:start="360" w:end="-20"/>
         <w:rPr>
@@ -1159,7 +1156,6 @@
     <w:p>
       <w:pPr>
         <w:pStyle w:val="Normal"/>
-        <w:pBdr/>
         <w:spacing w:lineRule="auto" w:line="240" w:before="0" w:after="0"/>
         <w:ind w:start="360"/>
         <w:rPr>
@@ -1180,7 +1176,6 @@
     <w:p>
       <w:pPr>
         <w:pStyle w:val="Normal"/>
-        <w:pBdr/>
         <w:spacing w:lineRule="auto" w:line="240" w:before="0" w:after="0"/>
         <w:ind w:start="360"/>
         <w:jc w:val="both"/>
@@ -1205,7 +1200,6 @@
           <w:ilvl w:val="0"/>
           <w:numId w:val="1"/>
         </w:numPr>
-        <w:pBdr/>
         <w:spacing w:lineRule="auto" w:line="240" w:before="0" w:after="0"/>
         <w:jc w:val="both"/>
         <w:rPr>
@@ -1245,7 +1239,6 @@
     <w:p>
       <w:pPr>
         <w:pStyle w:val="Normal"/>
-        <w:pBdr/>
         <w:spacing w:lineRule="auto" w:line="240" w:before="0" w:after="0"/>
         <w:jc w:val="both"/>
         <w:rPr>
@@ -1272,7 +1265,6 @@
           <w:ilvl w:val="0"/>
           <w:numId w:val="1"/>
         </w:numPr>
-        <w:pBdr/>
         <w:spacing w:lineRule="auto" w:line="240" w:before="0" w:after="0"/>
         <w:jc w:val="both"/>
         <w:rPr>
@@ -1399,7 +1391,6 @@
       <w:pPr>
         <w:pStyle w:val="Normal"/>
         <w:widowControl w:val="false"/>
-        <w:pBdr/>
         <w:spacing w:lineRule="auto" w:line="206" w:before="0" w:after="0"/>
         <w:ind w:start="360" w:end="-20"/>
         <w:rPr>
@@ -1419,7 +1410,6 @@
           <w:ilvl w:val="0"/>
           <w:numId w:val="1"/>
         </w:numPr>
-        <w:pBdr/>
         <w:spacing w:lineRule="auto" w:line="240" w:before="0" w:after="0"/>
         <w:jc w:val="both"/>
         <w:rPr>
@@ -1447,7 +1437,6 @@
     <w:p>
       <w:pPr>
         <w:pStyle w:val="Normal"/>
-        <w:pBdr/>
         <w:spacing w:lineRule="auto" w:line="240" w:before="0" w:after="0"/>
         <w:ind w:start="360"/>
         <w:jc w:val="both"/>
@@ -1468,7 +1457,6 @@
           <w:ilvl w:val="0"/>
           <w:numId w:val="1"/>
         </w:numPr>
-        <w:pBdr/>
         <w:spacing w:lineRule="auto" w:line="240" w:before="0" w:after="0"/>
         <w:jc w:val="both"/>
         <w:rPr>
@@ -1542,7 +1530,6 @@
           <w:ilvl w:val="0"/>
           <w:numId w:val="1"/>
         </w:numPr>
-        <w:pBdr/>
         <w:spacing w:lineRule="auto" w:line="240" w:before="0" w:after="0"/>
         <w:jc w:val="both"/>
         <w:rPr>
@@ -1576,8 +1563,8 @@
       <w:tblGrid>
         <w:gridCol w:w="1876"/>
         <w:gridCol w:w="2970"/>
-        <w:gridCol w:w="899"/>
-        <w:gridCol w:w="1531"/>
+        <w:gridCol w:w="898"/>
+        <w:gridCol w:w="1532"/>
         <w:gridCol w:w="3420"/>
       </w:tblGrid>
       <w:tr>
@@ -1638,7 +1625,7 @@
         </w:tc>
         <w:tc>
           <w:tcPr>
-            <w:tcW w:w="899" w:type="dxa"/>
+            <w:tcW w:w="898" w:type="dxa"/>
             <w:tcBorders>
               <w:top w:val="single" w:sz="4" w:space="0" w:color="000001"/>
               <w:start w:val="single" w:sz="4" w:space="0" w:color="000001"/>
@@ -1666,7 +1653,7 @@
         </w:tc>
         <w:tc>
           <w:tcPr>
-            <w:tcW w:w="1531" w:type="dxa"/>
+            <w:tcW w:w="1532" w:type="dxa"/>
             <w:tcBorders>
               <w:top w:val="single" w:sz="4" w:space="0" w:color="000001"/>
               <w:start w:val="single" w:sz="4" w:space="0" w:color="000001"/>
@@ -1811,7 +1798,7 @@
         </w:tc>
         <w:tc>
           <w:tcPr>
-            <w:tcW w:w="899" w:type="dxa"/>
+            <w:tcW w:w="898" w:type="dxa"/>
             <w:tcBorders>
               <w:top w:val="single" w:sz="4" w:space="0" w:color="000001"/>
               <w:start w:val="single" w:sz="4" w:space="0" w:color="000001"/>
@@ -1836,7 +1823,7 @@
         </w:tc>
         <w:tc>
           <w:tcPr>
-            <w:tcW w:w="1531" w:type="dxa"/>
+            <w:tcW w:w="1532" w:type="dxa"/>
             <w:tcBorders>
               <w:top w:val="single" w:sz="4" w:space="0" w:color="000001"/>
               <w:start w:val="single" w:sz="4" w:space="0" w:color="000001"/>
@@ -1963,7 +1950,6 @@
           <w:ilvl w:val="0"/>
           <w:numId w:val="1"/>
         </w:numPr>
-        <w:pBdr/>
         <w:spacing w:lineRule="auto" w:line="240" w:before="0" w:after="0"/>
         <w:jc w:val="both"/>
         <w:rPr>
@@ -1987,7 +1973,6 @@
       <w:pPr>
         <w:pStyle w:val="Normal"/>
         <w:widowControl w:val="false"/>
-        <w:pBdr/>
         <w:spacing w:lineRule="auto" w:line="240" w:before="0" w:after="0"/>
         <w:ind w:start="360"/>
         <w:rPr>
@@ -2016,7 +2001,6 @@
     <w:p>
       <w:pPr>
         <w:pStyle w:val="Normal"/>
-        <w:pBdr/>
         <w:spacing w:lineRule="auto" w:line="240" w:before="0" w:after="0"/>
         <w:ind w:start="360"/>
         <w:jc w:val="both"/>
@@ -2037,7 +2021,6 @@
     <w:p>
       <w:pPr>
         <w:pStyle w:val="Normal"/>
-        <w:pBdr/>
         <w:spacing w:lineRule="auto" w:line="240" w:before="0" w:after="0"/>
         <w:jc w:val="both"/>
         <w:rPr>
@@ -2125,7 +2108,6 @@
     <w:p>
       <w:pPr>
         <w:pStyle w:val="Normal"/>
-        <w:pBdr/>
         <w:spacing w:lineRule="auto" w:line="240" w:before="0" w:after="0"/>
         <w:rPr>
           <w:rFonts w:eastAsia="Calibri" w:cs="Calibri"/>
@@ -2608,7 +2590,6 @@
             <w:pPr>
               <w:pStyle w:val="Normal"/>
               <w:widowControl w:val="false"/>
-              <w:pBdr/>
               <w:spacing w:lineRule="auto" w:line="240" w:before="0" w:after="0"/>
               <w:jc w:val="center"/>
               <w:rPr>
@@ -2626,7 +2607,6 @@
             <w:pPr>
               <w:pStyle w:val="Normal"/>
               <w:widowControl w:val="false"/>
-              <w:pBdr/>
               <w:spacing w:lineRule="auto" w:line="240" w:before="0" w:after="0"/>
               <w:jc w:val="center"/>
               <w:rPr>
@@ -2644,7 +2624,6 @@
             <w:pPr>
               <w:pStyle w:val="Normal"/>
               <w:widowControl w:val="false"/>
-              <w:pBdr/>
               <w:spacing w:lineRule="auto" w:line="240" w:before="0" w:after="0"/>
               <w:jc w:val="center"/>
               <w:rPr>
@@ -2662,7 +2641,6 @@
             <w:pPr>
               <w:pStyle w:val="Normal"/>
               <w:widowControl w:val="false"/>
-              <w:pBdr/>
               <w:spacing w:lineRule="auto" w:line="240" w:before="0" w:after="0"/>
               <w:jc w:val="center"/>
               <w:rPr>
@@ -2680,7 +2658,6 @@
             <w:pPr>
               <w:pStyle w:val="Normal"/>
               <w:widowControl w:val="false"/>
-              <w:pBdr/>
               <w:spacing w:lineRule="auto" w:line="240" w:before="0" w:after="0"/>
               <w:jc w:val="center"/>
               <w:rPr>
@@ -2698,7 +2675,6 @@
             <w:pPr>
               <w:pStyle w:val="Normal"/>
               <w:widowControl w:val="false"/>
-              <w:pBdr/>
               <w:spacing w:lineRule="auto" w:line="240" w:before="0" w:after="0"/>
               <w:jc w:val="center"/>
               <w:rPr>
@@ -2716,7 +2692,6 @@
             <w:pPr>
               <w:pStyle w:val="Normal"/>
               <w:widowControl w:val="false"/>
-              <w:pBdr/>
               <w:spacing w:lineRule="auto" w:line="240" w:before="0" w:after="0"/>
               <w:jc w:val="center"/>
               <w:rPr>
@@ -2734,7 +2709,6 @@
             <w:pPr>
               <w:pStyle w:val="Normal"/>
               <w:widowControl w:val="false"/>
-              <w:pBdr/>
               <w:spacing w:lineRule="auto" w:line="240" w:before="0" w:after="0"/>
               <w:jc w:val="center"/>
               <w:rPr>
@@ -3013,8 +2987,8 @@
       <w:tblGrid>
         <w:gridCol w:w="1966"/>
         <w:gridCol w:w="2441"/>
-        <w:gridCol w:w="348"/>
-        <w:gridCol w:w="464"/>
+        <w:gridCol w:w="347"/>
+        <w:gridCol w:w="465"/>
         <w:gridCol w:w="428"/>
         <w:gridCol w:w="766"/>
         <w:gridCol w:w="941"/>
@@ -3243,7 +3217,7 @@
             </w:r>
             <w:r>
               <w:rPr/>
-              <w:t xml:space="preserve"> {{ petitioner.aliases|comma_join }}</w:t>
+              <w:t xml:space="preserve"> {{ petitioner.aliases|join(‘; ‘) }}</w:t>
             </w:r>
           </w:p>
         </w:tc>
@@ -3827,7 +3801,7 @@
         </w:tc>
         <w:tc>
           <w:tcPr>
-            <w:tcW w:w="2789" w:type="dxa"/>
+            <w:tcW w:w="2788" w:type="dxa"/>
             <w:gridSpan w:val="2"/>
             <w:tcBorders>
               <w:top w:val="single" w:sz="4" w:space="0" w:color="000001"/>
@@ -3855,7 +3829,7 @@
         </w:tc>
         <w:tc>
           <w:tcPr>
-            <w:tcW w:w="892" w:type="dxa"/>
+            <w:tcW w:w="893" w:type="dxa"/>
             <w:gridSpan w:val="2"/>
             <w:tcBorders>
               <w:top w:val="single" w:sz="4" w:space="0" w:color="000001"/>
@@ -4006,7 +3980,7 @@
         </w:tc>
         <w:tc>
           <w:tcPr>
-            <w:tcW w:w="2789" w:type="dxa"/>
+            <w:tcW w:w="2788" w:type="dxa"/>
             <w:gridSpan w:val="2"/>
             <w:tcBorders>
               <w:top w:val="single" w:sz="4" w:space="0" w:color="000001"/>
@@ -4032,7 +4006,7 @@
         </w:tc>
         <w:tc>
           <w:tcPr>
-            <w:tcW w:w="892" w:type="dxa"/>
+            <w:tcW w:w="893" w:type="dxa"/>
             <w:gridSpan w:val="2"/>
             <w:tcBorders>
               <w:top w:val="single" w:sz="4" w:space="0" w:color="000001"/>
@@ -4535,7 +4509,6 @@
   <w:p>
     <w:pPr>
       <w:pStyle w:val="Normal"/>
-      <w:pBdr/>
       <w:tabs>
         <w:tab w:val="clear" w:pos="720"/>
         <w:tab w:val="center" w:pos="4680" w:leader="none"/>
@@ -4581,7 +4554,6 @@
   <w:p>
     <w:pPr>
       <w:pStyle w:val="Normal"/>
-      <w:pBdr/>
       <w:tabs>
         <w:tab w:val="clear" w:pos="720"/>
         <w:tab w:val="center" w:pos="4680" w:leader="none"/>
@@ -4606,7 +4578,6 @@
   <w:p>
     <w:pPr>
       <w:pStyle w:val="Normal"/>
-      <w:pBdr/>
       <w:tabs>
         <w:tab w:val="clear" w:pos="720"/>
         <w:tab w:val="center" w:pos="4680" w:leader="none"/>
@@ -4652,7 +4623,6 @@
   <w:p>
     <w:pPr>
       <w:pStyle w:val="Normal"/>
-      <w:pBdr/>
       <w:tabs>
         <w:tab w:val="clear" w:pos="720"/>
         <w:tab w:val="center" w:pos="4680" w:leader="none"/>
@@ -4691,7 +4661,6 @@
   <w:p>
     <w:pPr>
       <w:pStyle w:val="Normal"/>
-      <w:pBdr/>
       <w:tabs>
         <w:tab w:val="clear" w:pos="720"/>
         <w:tab w:val="center" w:pos="4680" w:leader="none"/>
@@ -4716,7 +4685,6 @@
   <w:p>
     <w:pPr>
       <w:pStyle w:val="Normal"/>
-      <w:pBdr/>
       <w:tabs>
         <w:tab w:val="clear" w:pos="720"/>
         <w:tab w:val="center" w:pos="4680" w:leader="none"/>
@@ -5397,7 +5365,7 @@
       <w:textAlignment w:val="baseline"/>
     </w:pPr>
     <w:rPr>
-      <w:rFonts w:eastAsia="Times New Roman" w:cs="Times New Roman" w:ascii="Calibri" w:hAnsi="Calibri"/>
+      <w:rFonts w:ascii="Calibri" w:hAnsi="Calibri" w:eastAsia="Times New Roman" w:cs="Times New Roman"/>
       <w:color w:val="00000A"/>
       <w:kern w:val="0"/>
       <w:sz w:val="22"/>
@@ -5643,7 +5611,7 @@
       <w:jc w:val="start"/>
     </w:pPr>
     <w:rPr>
-      <w:rFonts w:eastAsia="Times New Roman" w:cs="Times New Roman" w:ascii="Calibri" w:hAnsi="Calibri"/>
+      <w:rFonts w:ascii="Calibri" w:hAnsi="Calibri" w:eastAsia="Times New Roman" w:cs="Times New Roman"/>
       <w:color w:val="00000A"/>
       <w:kern w:val="0"/>
       <w:sz w:val="22"/>

</xml_diff>